<commit_message>
fix: fixed duplication in deliveries table
</commit_message>
<xml_diff>
--- a/lab_work1/Лабораторная работа 1 - Проектирование и создание структуры базы данных.docx
+++ b/lab_work1/Лабораторная работа 1 - Проектирование и создание структуры базы данных.docx
@@ -1666,7 +1666,6 @@
           <w:bCs/>
           <w:sz w:val="28"/>
           <w:szCs w:val="28"/>
-          <w:lang w:val="en-US"/>
         </w:rPr>
       </w:pPr>
       <w:r>
@@ -1686,7 +1685,6 @@
           <w:bCs/>
           <w:sz w:val="28"/>
           <w:szCs w:val="28"/>
-          <w:lang w:val="en-US"/>
         </w:rPr>
         <w:t xml:space="preserve"> </w:t>
       </w:r>
@@ -1707,7 +1705,6 @@
           <w:bCs/>
           <w:sz w:val="28"/>
           <w:szCs w:val="28"/>
-          <w:lang w:val="en-US"/>
         </w:rPr>
         <w:t xml:space="preserve"> </w:t>
       </w:r>
@@ -1728,7 +1725,6 @@
           <w:bCs/>
           <w:sz w:val="28"/>
           <w:szCs w:val="28"/>
-          <w:lang w:val="en-US"/>
         </w:rPr>
         <w:t>:</w:t>
       </w:r>
@@ -1746,17 +1742,9 @@
           <w:rFonts w:ascii="Times New Roman" w:hAnsi="Times New Roman" w:cs="Times New Roman"/>
           <w:sz w:val="28"/>
           <w:szCs w:val="28"/>
-        </w:rPr>
-      </w:pPr>
-      <w:r>
-        <w:rPr>
-          <w:rFonts w:ascii="Times New Roman" w:hAnsi="Times New Roman" w:cs="Times New Roman"/>
-          <w:sz w:val="28"/>
-          <w:szCs w:val="28"/>
           <w:lang w:val="en-US"/>
         </w:rPr>
-        <w:t>products_flat</w:t>
-      </w:r>
+      </w:pPr>
       <w:r>
         <w:rPr>
           <w:rFonts w:ascii="Times New Roman" w:hAnsi="Times New Roman" w:cs="Times New Roman"/>
@@ -1764,16 +1752,7 @@
           <w:szCs w:val="28"/>
           <w:lang w:val="en-US"/>
         </w:rPr>
-        <w:t xml:space="preserve"> </w:t>
-      </w:r>
-      <w:r>
-        <w:rPr>
-          <w:rFonts w:ascii="Times New Roman" w:hAnsi="Times New Roman" w:cs="Times New Roman"/>
-          <w:sz w:val="28"/>
-          <w:szCs w:val="28"/>
-          <w:lang w:val="en-US"/>
-        </w:rPr>
-        <w:t>(product_id, title, price, seller_id, store_name, seller_email, category_id, category_name).</w:t>
+        <w:t>products_flat (product_id, title, price, seller_id, store_name, seller_email, category_id, category_name).</w:t>
       </w:r>
     </w:p>
     <w:p>
@@ -1966,17 +1945,7 @@
           <w:szCs w:val="28"/>
         </w:rPr>
         <w:lastRenderedPageBreak/>
-        <w:t>Устранение</w:t>
-      </w:r>
-      <w:r>
-        <w:rPr>
-          <w:rFonts w:ascii="Times New Roman" w:hAnsi="Times New Roman" w:cs="Times New Roman"/>
-          <w:b/>
-          <w:bCs/>
-          <w:sz w:val="28"/>
-          <w:szCs w:val="28"/>
-        </w:rPr>
-        <w:t>:</w:t>
+        <w:t>Устранение:</w:t>
       </w:r>
       <w:r>
         <w:rPr>
@@ -2187,16 +2156,9 @@
           <w:sz w:val="28"/>
           <w:szCs w:val="28"/>
         </w:rPr>
-        <w:t>order_items.unit_price</w:t>
-      </w:r>
-      <w:r>
-        <w:rPr>
-          <w:rFonts w:ascii="Times New Roman" w:hAnsi="Times New Roman" w:cs="Times New Roman"/>
-          <w:sz w:val="28"/>
-          <w:szCs w:val="28"/>
-        </w:rPr>
-        <w:t xml:space="preserve"> и </w:t>
-      </w:r>
+        <w:t>order_</w:t>
+      </w:r>
+      <w:proofErr w:type="gramStart"/>
       <w:r>
         <w:rPr>
           <w:rFonts w:ascii="Times New Roman" w:hAnsi="Times New Roman" w:cs="Times New Roman"/>
@@ -2205,15 +2167,56 @@
           <w:sz w:val="28"/>
           <w:szCs w:val="28"/>
         </w:rPr>
-        <w:t>deliveries.city/street/house/apartment</w:t>
-      </w:r>
-      <w:r>
-        <w:rPr>
-          <w:rFonts w:ascii="Times New Roman" w:hAnsi="Times New Roman" w:cs="Times New Roman"/>
-          <w:sz w:val="28"/>
-          <w:szCs w:val="28"/>
-        </w:rPr>
-        <w:t xml:space="preserve"> — для фиксации исторических значений на момент операции (снапшот). Это стандартный приём в системах, где важна историческая достоверность.</w:t>
+        <w:t>items.unit</w:t>
+      </w:r>
+      <w:proofErr w:type="gramEnd"/>
+      <w:r>
+        <w:rPr>
+          <w:rFonts w:ascii="Times New Roman" w:hAnsi="Times New Roman" w:cs="Times New Roman"/>
+          <w:i/>
+          <w:iCs/>
+          <w:sz w:val="28"/>
+          <w:szCs w:val="28"/>
+        </w:rPr>
+        <w:t>_price</w:t>
+      </w:r>
+      <w:r>
+        <w:rPr>
+          <w:rFonts w:ascii="Times New Roman" w:hAnsi="Times New Roman" w:cs="Times New Roman"/>
+          <w:sz w:val="28"/>
+          <w:szCs w:val="28"/>
+        </w:rPr>
+        <w:t xml:space="preserve"> и </w:t>
+      </w:r>
+      <w:proofErr w:type="gramStart"/>
+      <w:r>
+        <w:rPr>
+          <w:rFonts w:ascii="Times New Roman" w:hAnsi="Times New Roman" w:cs="Times New Roman"/>
+          <w:i/>
+          <w:iCs/>
+          <w:sz w:val="28"/>
+          <w:szCs w:val="28"/>
+        </w:rPr>
+        <w:t>deliveries.city</w:t>
+      </w:r>
+      <w:proofErr w:type="gramEnd"/>
+      <w:r>
+        <w:rPr>
+          <w:rFonts w:ascii="Times New Roman" w:hAnsi="Times New Roman" w:cs="Times New Roman"/>
+          <w:i/>
+          <w:iCs/>
+          <w:sz w:val="28"/>
+          <w:szCs w:val="28"/>
+        </w:rPr>
+        <w:t>/street/house/apartment</w:t>
+      </w:r>
+      <w:r>
+        <w:rPr>
+          <w:rFonts w:ascii="Times New Roman" w:hAnsi="Times New Roman" w:cs="Times New Roman"/>
+          <w:sz w:val="28"/>
+          <w:szCs w:val="28"/>
+        </w:rPr>
+        <w:t xml:space="preserve"> — для фиксации исторических значений на момент операции (снапшот).</w:t>
       </w:r>
     </w:p>
     <w:p>
@@ -2294,6 +2297,117 @@
           <w:szCs w:val="28"/>
         </w:rPr>
         <w:t>.</w:t>
+      </w:r>
+    </w:p>
+    <w:p>
+      <w:pPr>
+        <w:jc w:val="both"/>
+        <w:rPr>
+          <w:rFonts w:ascii="Times New Roman" w:hAnsi="Times New Roman" w:cs="Times New Roman"/>
+          <w:sz w:val="28"/>
+          <w:szCs w:val="28"/>
+        </w:rPr>
+      </w:pPr>
+      <w:r>
+        <w:rPr>
+          <w:rFonts w:ascii="Times New Roman" w:hAnsi="Times New Roman" w:cs="Times New Roman"/>
+          <w:sz w:val="28"/>
+          <w:szCs w:val="28"/>
+        </w:rPr>
+        <w:t xml:space="preserve">Для каждой таблицы был определен первичный ключ. </w:t>
+      </w:r>
+      <w:r>
+        <w:rPr>
+          <w:rFonts w:ascii="Times New Roman" w:hAnsi="Times New Roman" w:cs="Times New Roman"/>
+          <w:sz w:val="28"/>
+          <w:szCs w:val="28"/>
+        </w:rPr>
+        <w:t>Во всех таблицах используются суррогатные ключи (</w:t>
+      </w:r>
+      <w:r>
+        <w:rPr>
+          <w:rFonts w:ascii="Times New Roman" w:hAnsi="Times New Roman" w:cs="Times New Roman"/>
+          <w:sz w:val="28"/>
+          <w:szCs w:val="28"/>
+          <w:lang w:val="en-US"/>
+        </w:rPr>
+        <w:t>created</w:t>
+      </w:r>
+      <w:r>
+        <w:rPr>
+          <w:rFonts w:ascii="Times New Roman" w:hAnsi="Times New Roman" w:cs="Times New Roman"/>
+          <w:sz w:val="28"/>
+          <w:szCs w:val="28"/>
+        </w:rPr>
+        <w:t xml:space="preserve"> </w:t>
+      </w:r>
+      <w:r>
+        <w:rPr>
+          <w:rFonts w:ascii="Times New Roman" w:hAnsi="Times New Roman" w:cs="Times New Roman"/>
+          <w:sz w:val="28"/>
+          <w:szCs w:val="28"/>
+          <w:lang w:val="en-US"/>
+        </w:rPr>
+        <w:t>by</w:t>
+      </w:r>
+      <w:r>
+        <w:rPr>
+          <w:rFonts w:ascii="Times New Roman" w:hAnsi="Times New Roman" w:cs="Times New Roman"/>
+          <w:sz w:val="28"/>
+          <w:szCs w:val="28"/>
+        </w:rPr>
+        <w:t xml:space="preserve"> </w:t>
+      </w:r>
+      <w:r>
+        <w:rPr>
+          <w:rFonts w:ascii="Times New Roman" w:hAnsi="Times New Roman" w:cs="Times New Roman"/>
+          <w:sz w:val="28"/>
+          <w:szCs w:val="28"/>
+          <w:lang w:val="en-US"/>
+        </w:rPr>
+        <w:t>default</w:t>
+      </w:r>
+      <w:r>
+        <w:rPr>
+          <w:rFonts w:ascii="Times New Roman" w:hAnsi="Times New Roman" w:cs="Times New Roman"/>
+          <w:sz w:val="28"/>
+          <w:szCs w:val="28"/>
+        </w:rPr>
+        <w:t xml:space="preserve"> </w:t>
+      </w:r>
+      <w:r>
+        <w:rPr>
+          <w:rFonts w:ascii="Times New Roman" w:hAnsi="Times New Roman" w:cs="Times New Roman"/>
+          <w:sz w:val="28"/>
+          <w:szCs w:val="28"/>
+          <w:lang w:val="en-US"/>
+        </w:rPr>
+        <w:t>as</w:t>
+      </w:r>
+      <w:r>
+        <w:rPr>
+          <w:rFonts w:ascii="Times New Roman" w:hAnsi="Times New Roman" w:cs="Times New Roman"/>
+          <w:sz w:val="28"/>
+          <w:szCs w:val="28"/>
+        </w:rPr>
+        <w:t xml:space="preserve"> </w:t>
+      </w:r>
+      <w:r>
+        <w:rPr>
+          <w:rFonts w:ascii="Times New Roman" w:hAnsi="Times New Roman" w:cs="Times New Roman"/>
+          <w:sz w:val="28"/>
+          <w:szCs w:val="28"/>
+          <w:lang w:val="en-US"/>
+        </w:rPr>
+        <w:t>indentity</w:t>
+      </w:r>
+      <w:r>
+        <w:rPr>
+          <w:rFonts w:ascii="Times New Roman" w:hAnsi="Times New Roman" w:cs="Times New Roman"/>
+          <w:sz w:val="28"/>
+          <w:szCs w:val="28"/>
+        </w:rPr>
+        <w:t>), потому что:</w:t>
       </w:r>
     </w:p>
     <w:p>
@@ -2316,100 +2430,7 @@
           <w:sz w:val="28"/>
           <w:szCs w:val="28"/>
         </w:rPr>
-        <w:t xml:space="preserve">Для каждой таблицы был определен первичный ключ. </w:t>
-      </w:r>
-      <w:r>
-        <w:rPr>
-          <w:rFonts w:ascii="Times New Roman" w:hAnsi="Times New Roman" w:cs="Times New Roman"/>
-          <w:sz w:val="28"/>
-          <w:szCs w:val="28"/>
-        </w:rPr>
-        <w:t>Во всех таблицах используются суррогатные ключи (</w:t>
-      </w:r>
-      <w:r>
-        <w:rPr>
-          <w:rFonts w:ascii="Times New Roman" w:hAnsi="Times New Roman" w:cs="Times New Roman"/>
-          <w:sz w:val="28"/>
-          <w:szCs w:val="28"/>
-          <w:lang w:val="en-US"/>
-        </w:rPr>
-        <w:t>created</w:t>
-      </w:r>
-      <w:r>
-        <w:rPr>
-          <w:rFonts w:ascii="Times New Roman" w:hAnsi="Times New Roman" w:cs="Times New Roman"/>
-          <w:sz w:val="28"/>
-          <w:szCs w:val="28"/>
-        </w:rPr>
-        <w:t xml:space="preserve"> </w:t>
-      </w:r>
-      <w:r>
-        <w:rPr>
-          <w:rFonts w:ascii="Times New Roman" w:hAnsi="Times New Roman" w:cs="Times New Roman"/>
-          <w:sz w:val="28"/>
-          <w:szCs w:val="28"/>
-          <w:lang w:val="en-US"/>
-        </w:rPr>
-        <w:t>by</w:t>
-      </w:r>
-      <w:r>
-        <w:rPr>
-          <w:rFonts w:ascii="Times New Roman" w:hAnsi="Times New Roman" w:cs="Times New Roman"/>
-          <w:sz w:val="28"/>
-          <w:szCs w:val="28"/>
-        </w:rPr>
-        <w:t xml:space="preserve"> </w:t>
-      </w:r>
-      <w:r>
-        <w:rPr>
-          <w:rFonts w:ascii="Times New Roman" w:hAnsi="Times New Roman" w:cs="Times New Roman"/>
-          <w:sz w:val="28"/>
-          <w:szCs w:val="28"/>
-          <w:lang w:val="en-US"/>
-        </w:rPr>
-        <w:t>default</w:t>
-      </w:r>
-      <w:r>
-        <w:rPr>
-          <w:rFonts w:ascii="Times New Roman" w:hAnsi="Times New Roman" w:cs="Times New Roman"/>
-          <w:sz w:val="28"/>
-          <w:szCs w:val="28"/>
-        </w:rPr>
-        <w:t xml:space="preserve"> </w:t>
-      </w:r>
-      <w:r>
-        <w:rPr>
-          <w:rFonts w:ascii="Times New Roman" w:hAnsi="Times New Roman" w:cs="Times New Roman"/>
-          <w:sz w:val="28"/>
-          <w:szCs w:val="28"/>
-          <w:lang w:val="en-US"/>
-        </w:rPr>
-        <w:t>as</w:t>
-      </w:r>
-      <w:r>
-        <w:rPr>
-          <w:rFonts w:ascii="Times New Roman" w:hAnsi="Times New Roman" w:cs="Times New Roman"/>
-          <w:sz w:val="28"/>
-          <w:szCs w:val="28"/>
-        </w:rPr>
-        <w:t xml:space="preserve"> </w:t>
-      </w:r>
-      <w:r>
-        <w:rPr>
-          <w:rFonts w:ascii="Times New Roman" w:hAnsi="Times New Roman" w:cs="Times New Roman"/>
-          <w:sz w:val="28"/>
-          <w:szCs w:val="28"/>
-          <w:lang w:val="en-US"/>
-        </w:rPr>
-        <w:t>indentity</w:t>
-      </w:r>
-      <w:r>
-        <w:rPr>
-          <w:rFonts w:ascii="Times New Roman" w:hAnsi="Times New Roman" w:cs="Times New Roman"/>
-          <w:sz w:val="28"/>
-          <w:szCs w:val="28"/>
-        </w:rPr>
-        <w:t>), потому что:</w:t>
+        <w:t>естественные ключи (email, название магазина, название категории) могут меняться со временем, а PK меняться не должен;</w:t>
       </w:r>
     </w:p>
     <w:p>
@@ -2432,7 +2453,7 @@
           <w:sz w:val="28"/>
           <w:szCs w:val="28"/>
         </w:rPr>
-        <w:t>естественные ключи (email, название магазина, название категории) могут меняться со временем, а PK меняться не должен;</w:t>
+        <w:t>числовые суррогатные ключи компактнее и быстрее при индексировании и в FK;</w:t>
       </w:r>
     </w:p>
     <w:p>
@@ -2455,29 +2476,6 @@
           <w:sz w:val="28"/>
           <w:szCs w:val="28"/>
         </w:rPr>
-        <w:t>числовые суррогатные ключи компактнее и быстрее при индексировании и в FK;</w:t>
-      </w:r>
-    </w:p>
-    <w:p>
-      <w:pPr>
-        <w:pStyle w:val="a7"/>
-        <w:numPr>
-          <w:ilvl w:val="0"/>
-          <w:numId w:val="8"/>
-        </w:numPr>
-        <w:jc w:val="both"/>
-        <w:rPr>
-          <w:rFonts w:ascii="Times New Roman" w:hAnsi="Times New Roman" w:cs="Times New Roman"/>
-          <w:sz w:val="28"/>
-          <w:szCs w:val="28"/>
-        </w:rPr>
-      </w:pPr>
-      <w:r>
-        <w:rPr>
-          <w:rFonts w:ascii="Times New Roman" w:hAnsi="Times New Roman" w:cs="Times New Roman"/>
-          <w:sz w:val="28"/>
-          <w:szCs w:val="28"/>
-        </w:rPr>
         <w:t>для ассоциативных таблиц (order_items, cart_items) используется составной естественный ключ из двух FK — он отражает бизнес-правило «одна позиция на пару (заказ, товар)» и одновременно предотвращает дубли.</w:t>
       </w:r>
     </w:p>
@@ -2755,8 +2753,40 @@
           <w:rFonts w:ascii="Times New Roman" w:hAnsi="Times New Roman" w:cs="Times New Roman"/>
           <w:sz w:val="28"/>
           <w:szCs w:val="28"/>
+        </w:rPr>
+        <w:t xml:space="preserve"> </w:t>
+      </w:r>
+      <w:r>
+        <w:rPr>
+          <w:rFonts w:ascii="Times New Roman" w:hAnsi="Times New Roman" w:cs="Times New Roman"/>
+          <w:sz w:val="28"/>
+          <w:szCs w:val="28"/>
+        </w:rPr>
+        <w:t>запуск</w:t>
+      </w:r>
+      <w:r>
+        <w:rPr>
+          <w:rFonts w:ascii="Times New Roman" w:hAnsi="Times New Roman" w:cs="Times New Roman"/>
+          <w:sz w:val="28"/>
+          <w:szCs w:val="28"/>
+        </w:rPr>
+        <w:t xml:space="preserve"> (</w:t>
+      </w:r>
+      <w:r>
+        <w:rPr>
+          <w:rFonts w:ascii="Times New Roman" w:hAnsi="Times New Roman" w:cs="Times New Roman"/>
+          <w:sz w:val="28"/>
+          <w:szCs w:val="28"/>
           <w:lang w:val="en-US"/>
         </w:rPr>
+        <w:t>Drop</w:t>
+      </w:r>
+      <w:r>
+        <w:rPr>
+          <w:rFonts w:ascii="Times New Roman" w:hAnsi="Times New Roman" w:cs="Times New Roman"/>
+          <w:sz w:val="28"/>
+          <w:szCs w:val="28"/>
+        </w:rPr>
         <w:t xml:space="preserve"> </w:t>
       </w:r>
       <w:r>
@@ -2764,17 +2794,17 @@
           <w:rFonts w:ascii="Times New Roman" w:hAnsi="Times New Roman" w:cs="Times New Roman"/>
           <w:sz w:val="28"/>
           <w:szCs w:val="28"/>
-        </w:rPr>
-        <w:t>запуск</w:t>
-      </w:r>
-      <w:r>
-        <w:rPr>
-          <w:rFonts w:ascii="Times New Roman" w:hAnsi="Times New Roman" w:cs="Times New Roman"/>
-          <w:sz w:val="28"/>
-          <w:szCs w:val="28"/>
           <w:lang w:val="en-US"/>
         </w:rPr>
-        <w:t xml:space="preserve"> (</w:t>
+        <w:t>table</w:t>
+      </w:r>
+      <w:r>
+        <w:rPr>
+          <w:rFonts w:ascii="Times New Roman" w:hAnsi="Times New Roman" w:cs="Times New Roman"/>
+          <w:sz w:val="28"/>
+          <w:szCs w:val="28"/>
+        </w:rPr>
+        <w:t xml:space="preserve"> </w:t>
       </w:r>
       <w:r>
         <w:rPr>
@@ -2783,7 +2813,49 @@
           <w:szCs w:val="28"/>
           <w:lang w:val="en-US"/>
         </w:rPr>
-        <w:t>Drop table if exists … cascade)</w:t>
+        <w:t>if</w:t>
+      </w:r>
+      <w:r>
+        <w:rPr>
+          <w:rFonts w:ascii="Times New Roman" w:hAnsi="Times New Roman" w:cs="Times New Roman"/>
+          <w:sz w:val="28"/>
+          <w:szCs w:val="28"/>
+        </w:rPr>
+        <w:t xml:space="preserve"> </w:t>
+      </w:r>
+      <w:r>
+        <w:rPr>
+          <w:rFonts w:ascii="Times New Roman" w:hAnsi="Times New Roman" w:cs="Times New Roman"/>
+          <w:sz w:val="28"/>
+          <w:szCs w:val="28"/>
+          <w:lang w:val="en-US"/>
+        </w:rPr>
+        <w:t>exists</w:t>
+      </w:r>
+      <w:r>
+        <w:rPr>
+          <w:rFonts w:ascii="Times New Roman" w:hAnsi="Times New Roman" w:cs="Times New Roman"/>
+          <w:sz w:val="28"/>
+          <w:szCs w:val="28"/>
+        </w:rPr>
+        <w:t xml:space="preserve"> … </w:t>
+      </w:r>
+      <w:r>
+        <w:rPr>
+          <w:rFonts w:ascii="Times New Roman" w:hAnsi="Times New Roman" w:cs="Times New Roman"/>
+          <w:sz w:val="28"/>
+          <w:szCs w:val="28"/>
+          <w:lang w:val="en-US"/>
+        </w:rPr>
+        <w:t>cascade</w:t>
+      </w:r>
+      <w:r>
+        <w:rPr>
+          <w:rFonts w:ascii="Times New Roman" w:hAnsi="Times New Roman" w:cs="Times New Roman"/>
+          <w:sz w:val="28"/>
+          <w:szCs w:val="28"/>
+        </w:rPr>
+        <w:t>)</w:t>
       </w:r>
       <w:r>
         <w:rPr>
@@ -2801,7 +2873,6 @@
           <w:rFonts w:ascii="Times New Roman" w:hAnsi="Times New Roman" w:cs="Times New Roman"/>
           <w:sz w:val="28"/>
           <w:szCs w:val="28"/>
-          <w:lang w:val="en-US"/>
         </w:rPr>
       </w:pPr>
     </w:p>
@@ -3121,15 +3192,7 @@
           <w:sz w:val="28"/>
           <w:szCs w:val="28"/>
         </w:rPr>
-        <w:t xml:space="preserve">-скриптом. Запуск </w:t>
-      </w:r>
-      <w:r>
-        <w:rPr>
-          <w:rFonts w:ascii="Times New Roman" w:hAnsi="Times New Roman" w:cs="Times New Roman"/>
-          <w:sz w:val="28"/>
-          <w:szCs w:val="28"/>
-        </w:rPr>
-        <w:t xml:space="preserve">с помощью </w:t>
+        <w:t xml:space="preserve">-скриптом. Запуск с помощью </w:t>
       </w:r>
       <w:r>
         <w:rPr>
@@ -3235,15 +3298,7 @@
           <w:sz w:val="28"/>
           <w:szCs w:val="28"/>
         </w:rPr>
-        <w:t>в ходе</w:t>
-      </w:r>
-      <w:r>
-        <w:rPr>
-          <w:rFonts w:ascii="Times New Roman" w:hAnsi="Times New Roman" w:cs="Times New Roman"/>
-          <w:sz w:val="28"/>
-          <w:szCs w:val="28"/>
-        </w:rPr>
-        <w:t xml:space="preserve"> лабораторной работы </w:t>
+        <w:t xml:space="preserve">в ходе лабораторной работы </w:t>
       </w:r>
       <w:r>
         <w:rPr>
@@ -4891,6 +4946,7 @@
   <w:style w:type="character" w:default="1" w:styleId="a0">
     <w:name w:val="Default Paragraph Font"/>
     <w:uiPriority w:val="1"/>
+    <w:semiHidden/>
     <w:unhideWhenUsed/>
   </w:style>
   <w:style w:type="table" w:default="1" w:styleId="a1">

</xml_diff>